<commit_message>
First sequence: Mme Tsogo's F5, LSA and USA questions reworded in GCE style
Co-Authored-By: Claude Opus 5.5 <noreply@anthropic.com>
Claude-Session: https://claude.ai/code/session_0115LFSb2ktGLWPeVksFkSer
</commit_message>
<xml_diff>
--- a/epreuves/2026-2027/Sequence_1/F5_Geography_Seq1_2026-2027.docx
+++ b/epreuves/2026-2027/Sequence_1/F5_Geography_Seq1_2026-2027.docx
@@ -1559,15 +1559,15 @@
           <w:tab w:val="left" w:pos="1500"/>
         </w:tabs>
         <w:spacing w:after="70" w:line="300"/>
-        <w:ind w:left="1000" w:hanging="600"/>
-      </w:pPr>
-      <w:r>
-        <w:rPr>
-          <w:rFonts w:ascii="Times New Roman" w:cs="Times New Roman" w:eastAsia="Times New Roman" w:hAnsi="Times New Roman"/>
-          <w:sz w:val="24"/>
-          <w:szCs w:val="24"/>
-        </w:rPr>
-        <w:t xml:space="preserve">(a)	Define fishing and state </w:t>
+        <w:ind w:left="1500" w:hanging="1100"/>
+      </w:pPr>
+      <w:r>
+        <w:rPr>
+          <w:rFonts w:ascii="Times New Roman" w:cs="Times New Roman" w:eastAsia="Times New Roman" w:hAnsi="Times New Roman"/>
+          <w:sz w:val="24"/>
+          <w:szCs w:val="24"/>
+        </w:rPr>
+        <w:t xml:space="preserve">(a)	(i)	Define fishing. </w:t>
       </w:r>
       <w:r>
         <w:rPr>
@@ -1577,15 +1577,25 @@
           <w:sz w:val="24"/>
           <w:szCs w:val="24"/>
         </w:rPr>
-        <w:t xml:space="preserve">two</w:t>
-      </w:r>
-      <w:r>
-        <w:rPr>
-          <w:rFonts w:ascii="Times New Roman" w:cs="Times New Roman" w:eastAsia="Times New Roman" w:hAnsi="Times New Roman"/>
-          <w:sz w:val="24"/>
-          <w:szCs w:val="24"/>
-        </w:rPr>
-        <w:t xml:space="preserve"> methods of fishing used in Cameroon. </w:t>
+        <w:t xml:space="preserve">(1 mark)</w:t>
+      </w:r>
+    </w:p>
+    <w:p>
+      <w:pPr>
+        <w:tabs>
+          <w:tab w:val="left" w:pos="1000"/>
+          <w:tab w:val="left" w:pos="1500"/>
+        </w:tabs>
+        <w:spacing w:after="70" w:line="300"/>
+        <w:ind w:left="1500" w:hanging="1100"/>
+      </w:pPr>
+      <w:r>
+        <w:rPr>
+          <w:rFonts w:ascii="Times New Roman" w:cs="Times New Roman" w:eastAsia="Times New Roman" w:hAnsi="Times New Roman"/>
+          <w:sz w:val="24"/>
+          <w:szCs w:val="24"/>
+        </w:rPr>
+        <w:t xml:space="preserve">	(ii)	Describe </w:t>
       </w:r>
       <w:r>
         <w:rPr>
@@ -1595,7 +1605,25 @@
           <w:sz w:val="24"/>
           <w:szCs w:val="24"/>
         </w:rPr>
-        <w:t xml:space="preserve">(3 marks)</w:t>
+        <w:t xml:space="preserve">two</w:t>
+      </w:r>
+      <w:r>
+        <w:rPr>
+          <w:rFonts w:ascii="Times New Roman" w:cs="Times New Roman" w:eastAsia="Times New Roman" w:hAnsi="Times New Roman"/>
+          <w:sz w:val="24"/>
+          <w:szCs w:val="24"/>
+        </w:rPr>
+        <w:t xml:space="preserve"> methods of fishing used in Cameroon. </w:t>
+      </w:r>
+      <w:r>
+        <w:rPr>
+          <w:rFonts w:ascii="Times New Roman" w:cs="Times New Roman" w:eastAsia="Times New Roman" w:hAnsi="Times New Roman"/>
+          <w:b/>
+          <w:bCs/>
+          <w:sz w:val="24"/>
+          <w:szCs w:val="24"/>
+        </w:rPr>
+        <w:t xml:space="preserve">(2 marks)</w:t>
       </w:r>
     </w:p>
     <w:p>
@@ -1631,7 +1659,7 @@
           <w:sz w:val="24"/>
           <w:szCs w:val="24"/>
         </w:rPr>
-        <w:t xml:space="preserve"> advantages of fishing to the economy of Cameroon. </w:t>
+        <w:t xml:space="preserve"> ways in which fishing contributes to the economy of Cameroon. </w:t>
       </w:r>
       <w:r>
         <w:rPr>
@@ -1659,7 +1687,7 @@
           <w:sz w:val="24"/>
           <w:szCs w:val="24"/>
         </w:rPr>
-        <w:t xml:space="preserve">(c)	State </w:t>
+        <w:t xml:space="preserve">(c)	Outline </w:t>
       </w:r>
       <w:r>
         <w:rPr>
@@ -1677,7 +1705,7 @@
           <w:sz w:val="24"/>
           <w:szCs w:val="24"/>
         </w:rPr>
-        <w:t xml:space="preserve"> economic benefits of the exploitation of mineral resources to Cameroon. </w:t>
+        <w:t xml:space="preserve"> economic benefits of the exploitation of mineral resources in Cameroon. </w:t>
       </w:r>
       <w:r>
         <w:rPr>

</xml_diff>